<commit_message>
feat: integrate BIB QA QC in full export runner v3.4
</commit_message>
<xml_diff>
--- a/outputs/bib/PROJECT_PHOENIX_BIB_KNOWLEDGE_LIBRARY.docx
+++ b/outputs/bib/PROJECT_PHOENIX_BIB_KNOWLEDGE_LIBRARY.docx
@@ -20,7 +20,7 @@
     </w:p>
     <w:p>
       <w:r>
-        <w:t xml:space="preserve">Exportdatum: 2026-06-26T19:31:11</w:t>
+        <w:t xml:space="preserve">Exportdatum: 2026-06-26T23:17:19</w:t>
       </w:r>
     </w:p>
     <w:p>
@@ -30,7 +30,7 @@
     </w:p>
     <w:p>
       <w:r>
-        <w:t xml:space="preserve">Commit: a65e6d5</w:t>
+        <w:t xml:space="preserve">Commit: 25f9553</w:t>
       </w:r>
     </w:p>
     <w:p>

</xml_diff>

<commit_message>
feat: add Project Phoenix BIB workflow runner v3.5
</commit_message>
<xml_diff>
--- a/outputs/bib/PROJECT_PHOENIX_BIB_KNOWLEDGE_LIBRARY.docx
+++ b/outputs/bib/PROJECT_PHOENIX_BIB_KNOWLEDGE_LIBRARY.docx
@@ -20,7 +20,7 @@
     </w:p>
     <w:p>
       <w:r>
-        <w:t xml:space="preserve">Exportdatum: 2026-06-26T23:27:06</w:t>
+        <w:t xml:space="preserve">Exportdatum: 2026-06-26T23:41:06</w:t>
       </w:r>
     </w:p>
     <w:p>
@@ -30,12 +30,12 @@
     </w:p>
     <w:p>
       <w:r>
-        <w:t xml:space="preserve">Commit: ad88bee</w:t>
-      </w:r>
-    </w:p>
-    <w:p>
-      <w:r>
-        <w:t xml:space="preserve">Working tree clean: True</w:t>
+        <w:t xml:space="preserve">Commit: 7a7c6b5</w:t>
+      </w:r>
+    </w:p>
+    <w:p>
+      <w:r>
+        <w:t xml:space="preserve">Working tree clean: False</w:t>
       </w:r>
     </w:p>
     <w:p>

</xml_diff>